<commit_message>
V1.1 - Fix Table of Contents page numbers and BOM cell formatting
- TOC now uses { TOC \u \h \z } field with updateFields=1 so Word
  regenerates correct page numbers on open
- Fixed sub-header numbering (e.g. 3.1) and TOC level-2 entries
- BOM cell editor: rich formatting (bold, italic, alignment, bullets)
  now correctly renders in the generated Word document
- BOM cell editor: added italic, alignment, and bullet toolbar buttons
- Fixed Hours? checkbox and qty math restoring correctly on MCMXQ import
- Output filename simplified to proposal number + version only
- App version label updated to V1.1

Co-Authored-By: Claude Sonnet 4.6 <noreply@anthropic.com>
</commit_message>
<xml_diff>
--- a/template.docx
+++ b/template.docx
@@ -1960,23 +1960,23 @@
         <mc:AlternateContent>
           <mc:Choice Requires="wps">
             <w:drawing>
-              <wp:anchor distT="0" distB="0" distL="114300" distR="114300" simplePos="0" relativeHeight="251658245" behindDoc="0" locked="0" layoutInCell="1" allowOverlap="1" wp14:anchorId="69B0F8D9" wp14:editId="27EC29DF">
+              <wp:anchor distT="0" distB="0" distL="114300" distR="114300" simplePos="0" relativeHeight="251658245" behindDoc="0" locked="0" layoutInCell="1" allowOverlap="1" wp14:anchorId="69B0F8D9" wp14:editId="32B15AC6">
                 <wp:simplePos x="0" y="0"/>
                 <wp:positionH relativeFrom="margin">
-                  <wp:posOffset>-666750</wp:posOffset>
+                  <wp:posOffset>-667385</wp:posOffset>
                 </wp:positionH>
                 <wp:positionV relativeFrom="paragraph">
                   <wp:posOffset>369570</wp:posOffset>
                 </wp:positionV>
-                <wp:extent cx="3224530" cy="3857625"/>
+                <wp:extent cx="4105275" cy="3857625"/>
                 <wp:effectExtent l="0" t="0" r="0" b="0"/>
                 <wp:wrapThrough wrapText="bothSides">
                   <wp:wrapPolygon edited="0">
-                    <wp:start x="383" y="0"/>
-                    <wp:lineTo x="383" y="21440"/>
-                    <wp:lineTo x="21183" y="21440"/>
-                    <wp:lineTo x="21183" y="0"/>
-                    <wp:lineTo x="383" y="0"/>
+                    <wp:start x="301" y="0"/>
+                    <wp:lineTo x="301" y="21440"/>
+                    <wp:lineTo x="21249" y="21440"/>
+                    <wp:lineTo x="21249" y="0"/>
+                    <wp:lineTo x="301" y="0"/>
                   </wp:wrapPolygon>
                 </wp:wrapThrough>
                 <wp:docPr id="691873433" name="Text Box 15"/>
@@ -1988,7 +1988,7 @@
                       <wps:spPr>
                         <a:xfrm>
                           <a:off x="0" y="0"/>
-                          <a:ext cx="3224530" cy="3857625"/>
+                          <a:ext cx="4105275" cy="3857625"/>
                         </a:xfrm>
                         <a:prstGeom prst="rect">
                           <a:avLst/>
@@ -2184,7 +2184,11 @@
           </mc:Choice>
           <mc:Fallback>
             <w:pict>
-              <v:shape w14:anchorId="69B0F8D9" id="Text Box 15" o:spid="_x0000_s1030" type="#_x0000_t202" style="position:absolute;margin-left:-52.5pt;margin-top:29.1pt;width:253.9pt;height:303.75pt;z-index:251658245;visibility:visible;mso-wrap-style:square;mso-width-percent:0;mso-height-percent:0;mso-wrap-distance-left:9pt;mso-wrap-distance-top:0;mso-wrap-distance-right:9pt;mso-wrap-distance-bottom:0;mso-position-horizontal:absolute;mso-position-horizontal-relative:margin;mso-position-vertical:absolute;mso-position-vertical-relative:text;mso-width-percent:0;mso-height-percent:0;mso-width-relative:margin;mso-height-relative:margin;v-text-anchor:bottom" o:gfxdata="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" filled="f" stroked="f" strokeweight=".5pt">
+              <v:shapetype w14:anchorId="69B0F8D9" id="_x0000_t202" coordsize="21600,21600" o:spt="202" path="m,l,21600r21600,l21600,xe">
+                <v:stroke joinstyle="miter"/>
+                <v:path gradientshapeok="t" o:connecttype="rect"/>
+              </v:shapetype>
+              <v:shape id="Text Box 15" o:spid="_x0000_s1030" type="#_x0000_t202" style="position:absolute;margin-left:-52.55pt;margin-top:29.1pt;width:323.25pt;height:303.75pt;z-index:251658245;visibility:visible;mso-wrap-style:square;mso-width-percent:0;mso-height-percent:0;mso-wrap-distance-left:9pt;mso-wrap-distance-top:0;mso-wrap-distance-right:9pt;mso-wrap-distance-bottom:0;mso-position-horizontal:absolute;mso-position-horizontal-relative:margin;mso-position-vertical:absolute;mso-position-vertical-relative:text;mso-width-percent:0;mso-height-percent:0;mso-width-relative:margin;mso-height-relative:margin;v-text-anchor:bottom" o:gfxdata="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" filled="f" stroked="f" strokeweight=".5pt">
                 <v:textbox>
                   <w:txbxContent>
                     <w:p>
@@ -2869,7 +2873,7 @@
           <w:sz w:val="32"/>
           <w:szCs w:val="32"/>
         </w:rPr>
-        <w:t>Bill of Material:</w:t>
+        <w:t>{{ section.header }}</w:t>
       </w:r>
     </w:p>
     <w:p>
@@ -2964,8 +2968,37 @@
         <w:rPr>
           <w:rFonts w:ascii="Aptos Narrow" w:hAnsi="Aptos Narrow" w:cs="Arial"/>
         </w:rPr>
-        <w:t xml:space="preserve"> %}</w:t>
+        <w:t xml:space="preserve"> </w:t>
       </w:r>
+      <w:proofErr w:type="gramStart"/>
+      <w:r>
+        <w:rPr>
+          <w:rFonts w:ascii="Aptos Narrow" w:hAnsi="Aptos Narrow" w:cs="Arial"/>
+        </w:rPr>
+        <w:t>%}</w:t>
+      </w:r>
+      <w:r>
+        <w:rPr>
+          <w:rFonts w:ascii="Aptos Narrow" w:hAnsi="Aptos Narrow" w:cs="Arial"/>
+        </w:rPr>
+        <w:t>Payment</w:t>
+      </w:r>
+      <w:proofErr w:type="gramEnd"/>
+      <w:r>
+        <w:rPr>
+          <w:rFonts w:ascii="Aptos Narrow" w:hAnsi="Aptos Narrow" w:cs="Arial"/>
+        </w:rPr>
+        <w:t xml:space="preserve"> terms are Net 30. Prices are valid for 30 days from date of issue.</w:t>
+      </w:r>
+    </w:p>
+    <w:p>
+      <w:pPr>
+        <w:spacing w:after="0"/>
+        <w:jc w:val="both"/>
+        <w:rPr>
+          <w:rFonts w:ascii="Aptos Narrow" w:hAnsi="Aptos Narrow" w:cs="Arial"/>
+        </w:rPr>
+      </w:pPr>
     </w:p>
     <w:p>
       <w:pPr>
@@ -9090,6 +9123,19 @@
 </file>
 
 <file path=customXml/item2.xml><?xml version="1.0" encoding="utf-8"?>
+<b:Sources xmlns:b="http://schemas.openxmlformats.org/officeDocument/2006/bibliography" xmlns="http://schemas.openxmlformats.org/officeDocument/2006/bibliography" SelectedStyle="\APASixthEditionOfficeOnline.xsl" StyleName="APA" Version="6"/>
+</file>
+
+<file path=customXml/item3.xml><?xml version="1.0" encoding="utf-8"?>
+<?mso-contentType ?>
+<FormTemplates xmlns="http://schemas.microsoft.com/sharepoint/v3/contenttype/forms">
+  <Display>DocumentLibraryForm</Display>
+  <Edit>DocumentLibraryForm</Edit>
+  <New>DocumentLibraryForm</New>
+</FormTemplates>
+</file>
+
+<file path=customXml/item4.xml><?xml version="1.0" encoding="utf-8"?>
 <p:properties xmlns:p="http://schemas.microsoft.com/office/2006/metadata/properties" xmlns:xsi="http://www.w3.org/2001/XMLSchema-instance" xmlns:pc="http://schemas.microsoft.com/office/infopath/2007/PartnerControls">
   <documentManagement>
     <TaxCatchAll xmlns="1240a608-ab0c-4b9e-a7e8-98b322547dfc" xsi:nil="true"/>
@@ -9105,19 +9151,6 @@
     </LastEdited>
   </documentManagement>
 </p:properties>
-</file>
-
-<file path=customXml/item3.xml><?xml version="1.0" encoding="utf-8"?>
-<?mso-contentType ?>
-<FormTemplates xmlns="http://schemas.microsoft.com/sharepoint/v3/contenttype/forms">
-  <Display>DocumentLibraryForm</Display>
-  <Edit>DocumentLibraryForm</Edit>
-  <New>DocumentLibraryForm</New>
-</FormTemplates>
-</file>
-
-<file path=customXml/item4.xml><?xml version="1.0" encoding="utf-8"?>
-<b:Sources xmlns:b="http://schemas.openxmlformats.org/officeDocument/2006/bibliography" xmlns="http://schemas.openxmlformats.org/officeDocument/2006/bibliography" SelectedStyle="\APASixthEditionOfficeOnline.xsl" StyleName="APA" Version="6"/>
 </file>
 
 <file path=customXml/itemProps1.xml><?xml version="1.0" encoding="utf-8"?>
@@ -9140,12 +9173,9 @@
 </file>
 
 <file path=customXml/itemProps2.xml><?xml version="1.0" encoding="utf-8"?>
-<ds:datastoreItem xmlns:ds="http://schemas.openxmlformats.org/officeDocument/2006/customXml" ds:itemID="{198F2852-3330-4053-9879-43F29ED4AB86}">
+<ds:datastoreItem xmlns:ds="http://schemas.openxmlformats.org/officeDocument/2006/customXml" ds:itemID="{019E14DF-1C9B-43A7-814A-E736EE78D25A}">
   <ds:schemaRefs>
-    <ds:schemaRef ds:uri="http://schemas.microsoft.com/office/2006/metadata/properties"/>
-    <ds:schemaRef ds:uri="http://schemas.microsoft.com/office/infopath/2007/PartnerControls"/>
-    <ds:schemaRef ds:uri="1240a608-ab0c-4b9e-a7e8-98b322547dfc"/>
-    <ds:schemaRef ds:uri="17280a2b-37da-44d9-bded-03910e228e5a"/>
+    <ds:schemaRef ds:uri="http://schemas.openxmlformats.org/officeDocument/2006/bibliography"/>
   </ds:schemaRefs>
 </ds:datastoreItem>
 </file>
@@ -9159,9 +9189,12 @@
 </file>
 
 <file path=customXml/itemProps4.xml><?xml version="1.0" encoding="utf-8"?>
-<ds:datastoreItem xmlns:ds="http://schemas.openxmlformats.org/officeDocument/2006/customXml" ds:itemID="{019E14DF-1C9B-43A7-814A-E736EE78D25A}">
+<ds:datastoreItem xmlns:ds="http://schemas.openxmlformats.org/officeDocument/2006/customXml" ds:itemID="{198F2852-3330-4053-9879-43F29ED4AB86}">
   <ds:schemaRefs>
-    <ds:schemaRef ds:uri="http://schemas.openxmlformats.org/officeDocument/2006/bibliography"/>
+    <ds:schemaRef ds:uri="http://schemas.microsoft.com/office/2006/metadata/properties"/>
+    <ds:schemaRef ds:uri="http://schemas.microsoft.com/office/infopath/2007/PartnerControls"/>
+    <ds:schemaRef ds:uri="1240a608-ab0c-4b9e-a7e8-98b322547dfc"/>
+    <ds:schemaRef ds:uri="17280a2b-37da-44d9-bded-03910e228e5a"/>
   </ds:schemaRefs>
 </ds:datastoreItem>
 </file>

</xml_diff>